<commit_message>
Publish Module 2: Prompt Engineering & Output Evaluation
</commit_message>
<xml_diff>
--- a/Courses/145130/_source/MCCTC_145130_Applications_of_AI_Syllabus_v2_2026-2027.docx
+++ b/Courses/145130/_source/MCCTC_145130_Applications_of_AI_Syllabus_v2_2026-2027.docx
@@ -76,7 +76,7 @@
           <w:sz w:val="21"/>
           <w:szCs w:val="21"/>
         </w:rPr>
-        <w:t xml:space="preserve">2026–2027  ·  September 8, 2026 – January 29, 2027  ·  WebXam Code JSL0</w:t>
+        <w:t xml:space="preserve">18 weeks  ·  Six three-week modules  ·  WebXam Code JSL0</w:t>
       </w:r>
     </w:p>
     <w:p>
@@ -90,7 +90,7 @@
           <w:sz w:val="21"/>
           <w:szCs w:val="21"/>
         </w:rPr>
-        <w:t xml:space="preserve">Version 2.0  ·  Six-Module Structure  ·  Instructor: Michael Sekol</w:t>
+        <w:t xml:space="preserve">Version 2.1  ·  Six-Module Structure  ·  Instructor: Michael Sekol</w:t>
       </w:r>
     </w:p>
     <w:p>
@@ -1900,7 +1900,7 @@
           <w:sz w:val="25"/>
           <w:szCs w:val="25"/>
         </w:rPr>
-        <w:t xml:space="preserve">Assessments and hard dates</w:t>
+        <w:t xml:space="preserve">Assessments and external events</w:t>
       </w:r>
     </w:p>
     <w:tbl>
@@ -2031,7 +2031,7 @@
                 <w:sz w:val="17"/>
                 <w:szCs w:val="17"/>
               </w:rPr>
-              <w:t xml:space="preserve">Week 3 — September 21–25. Fall window closes October 2.</w:t>
+              <w:t xml:space="preserve">Week 3</w:t>
             </w:r>
           </w:p>
         </w:tc>
@@ -2089,7 +2089,7 @@
                 <w:sz w:val="17"/>
                 <w:szCs w:val="17"/>
               </w:rPr>
-              <w:t xml:space="preserve">October 26, 12:00 pm ET</w:t>
+              <w:t xml:space="preserve">Usually Week 8. Your instructor confirms this year's deadline.</w:t>
             </w:r>
           </w:p>
         </w:tc>
@@ -2145,7 +2145,7 @@
                 <w:sz w:val="17"/>
                 <w:szCs w:val="17"/>
               </w:rPr>
-              <w:t xml:space="preserve">November 24</w:t>
+              <w:t xml:space="preserve">Usually at the end of Module 4. Your instructor confirms the date.</w:t>
             </w:r>
           </w:p>
         </w:tc>
@@ -2203,7 +2203,7 @@
                 <w:sz w:val="17"/>
                 <w:szCs w:val="17"/>
               </w:rPr>
-              <w:t xml:space="preserve">December 7–9</w:t>
+              <w:t xml:space="preserve">Usually Week 14, the competition week</w:t>
             </w:r>
           </w:p>
         </w:tc>
@@ -2259,7 +2259,7 @@
                 <w:sz w:val="17"/>
                 <w:szCs w:val="17"/>
               </w:rPr>
-              <w:t xml:space="preserve">December 11</w:t>
+              <w:t xml:space="preserve">Usually Week 14, the competition week</w:t>
             </w:r>
           </w:p>
         </w:tc>
@@ -2317,7 +2317,7 @@
                 <w:sz w:val="17"/>
                 <w:szCs w:val="17"/>
               </w:rPr>
-              <w:t xml:space="preserve">February 4, after this course ends</w:t>
+              <w:t xml:space="preserve">After this course ends</w:t>
             </w:r>
           </w:p>
         </w:tc>
@@ -2373,7 +2373,7 @@
                 <w:sz w:val="17"/>
                 <w:szCs w:val="17"/>
               </w:rPr>
-              <w:t xml:space="preserve">Week 19 — January 25–29</w:t>
+              <w:t xml:space="preserve">Week 18, the last week of Module 6</w:t>
             </w:r>
           </w:p>
         </w:tc>
@@ -4842,7 +4842,7 @@
           <w:sz w:val="21"/>
           <w:szCs w:val="21"/>
         </w:rPr>
-        <w:t xml:space="preserve">Each module is three weeks. Each has an entry check, a performance task, and exit criteria. Modules 1 through 3 are Grading Period 1. Modules 4 through 6 are Grading Period 2, with Week 19 reserved for assessment and demonstration.</w:t>
+        <w:t xml:space="preserve">Each module is three weeks. Each has an entry check, a performance task, and exit criteria. Modules 1 through 3 are Grading Period 1. Modules 4 through 6 are Grading Period 2. Week 18, the last week of Module 6, introduces no new content and carries assessment and demonstration.</w:t>
       </w:r>
     </w:p>
     <w:p>
@@ -4964,7 +4964,7 @@
                 <w:sz w:val="16"/>
                 <w:szCs w:val="16"/>
               </w:rPr>
-              <w:t xml:space="preserve">DATES  </w:t>
+              <w:t xml:space="preserve">GRADING PERIOD  </w:t>
             </w:r>
             <w:r>
               <w:rPr>
@@ -4973,7 +4973,7 @@
                 <w:sz w:val="18"/>
                 <w:szCs w:val="18"/>
               </w:rPr>
-              <w:t xml:space="preserve">Sept 8 – Sept 25</w:t>
+              <w:t xml:space="preserve">1</w:t>
             </w:r>
           </w:p>
         </w:tc>
@@ -5449,7 +5449,7 @@
                 <w:sz w:val="16"/>
                 <w:szCs w:val="16"/>
               </w:rPr>
-              <w:t xml:space="preserve">DATES  </w:t>
+              <w:t xml:space="preserve">GRADING PERIOD  </w:t>
             </w:r>
             <w:r>
               <w:rPr>
@@ -5458,7 +5458,7 @@
                 <w:sz w:val="18"/>
                 <w:szCs w:val="18"/>
               </w:rPr>
-              <w:t xml:space="preserve">Sept 28 – Oct 16</w:t>
+              <w:t xml:space="preserve">1</w:t>
             </w:r>
           </w:p>
         </w:tc>
@@ -5915,7 +5915,7 @@
                 <w:sz w:val="16"/>
                 <w:szCs w:val="16"/>
               </w:rPr>
-              <w:t xml:space="preserve">DATES  </w:t>
+              <w:t xml:space="preserve">GRADING PERIOD  </w:t>
             </w:r>
             <w:r>
               <w:rPr>
@@ -5924,7 +5924,7 @@
                 <w:sz w:val="18"/>
                 <w:szCs w:val="18"/>
               </w:rPr>
-              <w:t xml:space="preserve">Oct 19 – Nov 6</w:t>
+              <w:t xml:space="preserve">1</w:t>
             </w:r>
           </w:p>
         </w:tc>
@@ -6249,7 +6249,7 @@
           <w:sz w:val="20"/>
           <w:szCs w:val="20"/>
         </w:rPr>
-        <w:t xml:space="preserve">CONGRESSIONAL APP CHALLENGE submission — October 26</w:t>
+        <w:t xml:space="preserve">CONGRESSIONAL APP CHALLENGE submission, deadline usually in Week 8</w:t>
       </w:r>
     </w:p>
     <w:p>
@@ -6268,7 +6268,7 @@
           <w:sz w:val="20"/>
           <w:szCs w:val="20"/>
         </w:rPr>
-        <w:t xml:space="preserve">GP1 ENDS November 6</w:t>
+        <w:t xml:space="preserve">GP1 ENDS Week 9</w:t>
       </w:r>
     </w:p>
     <w:p>
@@ -6476,7 +6476,7 @@
                 <w:sz w:val="16"/>
                 <w:szCs w:val="16"/>
               </w:rPr>
-              <w:t xml:space="preserve">DATES  </w:t>
+              <w:t xml:space="preserve">GRADING PERIOD  </w:t>
             </w:r>
             <w:r>
               <w:rPr>
@@ -6485,7 +6485,7 @@
                 <w:sz w:val="18"/>
                 <w:szCs w:val="18"/>
               </w:rPr>
-              <w:t xml:space="preserve">Nov 9 – Nov 24</w:t>
+              <w:t xml:space="preserve">2</w:t>
             </w:r>
           </w:p>
         </w:tc>
@@ -6791,7 +6791,7 @@
           <w:sz w:val="20"/>
           <w:szCs w:val="20"/>
         </w:rPr>
-        <w:t xml:space="preserve">BPA PRE-SUBMISSION — November 24</w:t>
+        <w:t xml:space="preserve">BPA PRE-SUBMISSION, usually at the end of this module</w:t>
       </w:r>
     </w:p>
     <w:p>
@@ -6999,7 +6999,7 @@
                 <w:sz w:val="16"/>
                 <w:szCs w:val="16"/>
               </w:rPr>
-              <w:t xml:space="preserve">DATES  </w:t>
+              <w:t xml:space="preserve">GRADING PERIOD  </w:t>
             </w:r>
             <w:r>
               <w:rPr>
@@ -7008,7 +7008,7 @@
                 <w:sz w:val="18"/>
                 <w:szCs w:val="18"/>
               </w:rPr>
-              <w:t xml:space="preserve">Nov 30 – Dec 18</w:t>
+              <w:t xml:space="preserve">2</w:t>
             </w:r>
           </w:p>
         </w:tc>
@@ -7276,7 +7276,7 @@
           <w:sz w:val="20"/>
           <w:szCs w:val="20"/>
         </w:rPr>
-        <w:t xml:space="preserve">BPA REGIONAL CODING EVENTS December 7–9  ·  PRESENTATIONS December 11</w:t>
+        <w:t xml:space="preserve">BPA REGIONAL CODING EVENTS AND PRESENTATIONS, usually Week 14</w:t>
       </w:r>
     </w:p>
     <w:p>
@@ -7484,7 +7484,7 @@
                 <w:sz w:val="16"/>
                 <w:szCs w:val="16"/>
               </w:rPr>
-              <w:t xml:space="preserve">DATES  </w:t>
+              <w:t xml:space="preserve">GRADING PERIOD  </w:t>
             </w:r>
             <w:r>
               <w:rPr>
@@ -7493,7 +7493,7 @@
                 <w:sz w:val="18"/>
                 <w:szCs w:val="18"/>
               </w:rPr>
-              <w:t xml:space="preserve">Jan 4 – Jan 22</w:t>
+              <w:t xml:space="preserve">2</w:t>
             </w:r>
           </w:p>
         </w:tc>
@@ -7926,7 +7926,7 @@
           <w:sz w:val="25"/>
           <w:szCs w:val="25"/>
         </w:rPr>
-        <w:t xml:space="preserve">Week 19  ·  Assessment &amp; Demonstration  ·  January 25–29</w:t>
+        <w:t xml:space="preserve">Week 18  ·  Assessment &amp; Demonstration  ·  the last week of Module 6</w:t>
       </w:r>
     </w:p>
     <w:p>
@@ -8047,7 +8047,7 @@
           <w:sz w:val="20"/>
           <w:szCs w:val="20"/>
         </w:rPr>
-        <w:t xml:space="preserve">GP2 ENDS January 29</w:t>
+        <w:t xml:space="preserve">GP2 ENDS Week 18</w:t>
       </w:r>
     </w:p>
     <w:p>
@@ -8115,7 +8115,7 @@
           <w:sz w:val="25"/>
           <w:szCs w:val="25"/>
         </w:rPr>
-        <w:t xml:space="preserve">Grading Period 1  ·  September 8 – November 6  ·  Modules 1–3</w:t>
+        <w:t xml:space="preserve">Grading Period 1  ·  Weeks 1–9  ·  Modules 1–3</w:t>
       </w:r>
     </w:p>
     <w:tbl>
@@ -8132,9 +8132,8 @@
       </w:tblPr>
       <w:tblGrid>
         <w:gridCol w:w="900"/>
-        <w:gridCol w:w="1900"/>
         <w:gridCol w:w="3200"/>
-        <w:gridCol w:w="3360"/>
+        <w:gridCol w:w="5260"/>
       </w:tblGrid>
       <w:tr>
         <w:trPr>
@@ -8170,34 +8169,6 @@
         </w:tc>
         <w:tc>
           <w:tcPr>
-            <w:tcW w:type="dxa" w:w="1900"/>
-            <w:shd w:fill="1B3A5F" w:color="auto" w:val="clear"/>
-            <w:tcMar>
-              <w:top w:type="dxa" w:w="90"/>
-              <w:left w:type="dxa" w:w="130"/>
-              <w:bottom w:type="dxa" w:w="90"/>
-              <w:right w:type="dxa" w:w="130"/>
-            </w:tcMar>
-          </w:tcPr>
-          <w:p>
-            <w:pPr>
-              <w:spacing w:after="0" w:before="0" w:line="276"/>
-            </w:pPr>
-            <w:r>
-              <w:rPr>
-                <w:rFonts w:ascii="Calibri" w:cs="Calibri" w:eastAsia="Calibri" w:hAnsi="Calibri"/>
-                <w:b/>
-                <w:bCs/>
-                <w:color w:val="FFFFFF"/>
-                <w:sz w:val="17"/>
-                <w:szCs w:val="17"/>
-              </w:rPr>
-              <w:t xml:space="preserve">DATES</w:t>
-            </w:r>
-          </w:p>
-        </w:tc>
-        <w:tc>
-          <w:tcPr>
             <w:tcW w:type="dxa" w:w="3200"/>
             <w:shd w:fill="1B3A5F" w:color="auto" w:val="clear"/>
             <w:tcMar>
@@ -8226,7 +8197,7 @@
         </w:tc>
         <w:tc>
           <w:tcPr>
-            <w:tcW w:type="dxa" w:w="3360"/>
+            <w:tcW w:type="dxa" w:w="5260"/>
             <w:shd w:fill="1B3A5F" w:color="auto" w:val="clear"/>
             <w:tcMar>
               <w:top w:type="dxa" w:w="90"/>
@@ -8283,33 +8254,6 @@
         </w:tc>
         <w:tc>
           <w:tcPr>
-            <w:tcW w:type="dxa" w:w="1900"/>
-            <w:tcMar>
-              <w:top w:type="dxa" w:w="90"/>
-              <w:left w:type="dxa" w:w="130"/>
-              <w:bottom w:type="dxa" w:w="90"/>
-              <w:right w:type="dxa" w:w="130"/>
-            </w:tcMar>
-          </w:tcPr>
-          <w:p>
-            <w:pPr>
-              <w:spacing w:after="0" w:before="0" w:line="276"/>
-            </w:pPr>
-            <w:r>
-              <w:rPr>
-                <w:rFonts w:ascii="Calibri" w:cs="Calibri" w:eastAsia="Calibri" w:hAnsi="Calibri"/>
-                <w:b w:val="false"/>
-                <w:bCs w:val="false"/>
-                <w:color w:val="333333"/>
-                <w:sz w:val="17"/>
-                <w:szCs w:val="17"/>
-              </w:rPr>
-              <w:t xml:space="preserve">Sept 8–11</w:t>
-            </w:r>
-          </w:p>
-        </w:tc>
-        <w:tc>
-          <w:tcPr>
             <w:tcW w:type="dxa" w:w="3200"/>
             <w:tcMar>
               <w:top w:type="dxa" w:w="90"/>
@@ -8337,28 +8281,28 @@
         </w:tc>
         <w:tc>
           <w:tcPr>
-            <w:tcW w:type="dxa" w:w="3360"/>
-            <w:tcMar>
-              <w:top w:type="dxa" w:w="90"/>
-              <w:left w:type="dxa" w:w="130"/>
-              <w:bottom w:type="dxa" w:w="90"/>
-              <w:right w:type="dxa" w:w="130"/>
-            </w:tcMar>
-          </w:tcPr>
-          <w:p>
-            <w:pPr>
-              <w:spacing w:after="0" w:before="0" w:line="276"/>
-            </w:pPr>
-            <w:r>
-              <w:rPr>
-                <w:rFonts w:ascii="Calibri" w:cs="Calibri" w:eastAsia="Calibri" w:hAnsi="Calibri"/>
-                <w:b w:val="false"/>
-                <w:bCs w:val="false"/>
-                <w:color w:val="333333"/>
-                <w:sz w:val="17"/>
-                <w:szCs w:val="17"/>
-              </w:rPr>
-              <w:t xml:space="preserve">First day Sept 8. Local model setup. Repository created.</w:t>
+            <w:tcW w:type="dxa" w:w="5260"/>
+            <w:tcMar>
+              <w:top w:type="dxa" w:w="90"/>
+              <w:left w:type="dxa" w:w="130"/>
+              <w:bottom w:type="dxa" w:w="90"/>
+              <w:right w:type="dxa" w:w="130"/>
+            </w:tcMar>
+          </w:tcPr>
+          <w:p>
+            <w:pPr>
+              <w:spacing w:after="0" w:before="0" w:line="276"/>
+            </w:pPr>
+            <w:r>
+              <w:rPr>
+                <w:rFonts w:ascii="Calibri" w:cs="Calibri" w:eastAsia="Calibri" w:hAnsi="Calibri"/>
+                <w:b w:val="false"/>
+                <w:bCs w:val="false"/>
+                <w:color w:val="333333"/>
+                <w:sz w:val="17"/>
+                <w:szCs w:val="17"/>
+              </w:rPr>
+              <w:t xml:space="preserve">First week. Local model setup. Repository created.</w:t>
             </w:r>
           </w:p>
         </w:tc>
@@ -8394,34 +8338,6 @@
         </w:tc>
         <w:tc>
           <w:tcPr>
-            <w:tcW w:type="dxa" w:w="1900"/>
-            <w:shd w:fill="F2F5F9" w:color="auto" w:val="clear"/>
-            <w:tcMar>
-              <w:top w:type="dxa" w:w="90"/>
-              <w:left w:type="dxa" w:w="130"/>
-              <w:bottom w:type="dxa" w:w="90"/>
-              <w:right w:type="dxa" w:w="130"/>
-            </w:tcMar>
-          </w:tcPr>
-          <w:p>
-            <w:pPr>
-              <w:spacing w:after="0" w:before="0" w:line="276"/>
-            </w:pPr>
-            <w:r>
-              <w:rPr>
-                <w:rFonts w:ascii="Calibri" w:cs="Calibri" w:eastAsia="Calibri" w:hAnsi="Calibri"/>
-                <w:b w:val="false"/>
-                <w:bCs w:val="false"/>
-                <w:color w:val="333333"/>
-                <w:sz w:val="17"/>
-                <w:szCs w:val="17"/>
-              </w:rPr>
-              <w:t xml:space="preserve">Sept 14–18</w:t>
-            </w:r>
-          </w:p>
-        </w:tc>
-        <w:tc>
-          <w:tcPr>
             <w:tcW w:type="dxa" w:w="3200"/>
             <w:shd w:fill="F2F5F9" w:color="auto" w:val="clear"/>
             <w:tcMar>
@@ -8450,7 +8366,7 @@
         </w:tc>
         <w:tc>
           <w:tcPr>
-            <w:tcW w:type="dxa" w:w="3360"/>
+            <w:tcW w:type="dxa" w:w="5260"/>
             <w:shd w:fill="F2F5F9" w:color="auto" w:val="clear"/>
             <w:tcMar>
               <w:top w:type="dxa" w:w="90"/>
@@ -8507,33 +8423,6 @@
         </w:tc>
         <w:tc>
           <w:tcPr>
-            <w:tcW w:type="dxa" w:w="1900"/>
-            <w:tcMar>
-              <w:top w:type="dxa" w:w="90"/>
-              <w:left w:type="dxa" w:w="130"/>
-              <w:bottom w:type="dxa" w:w="90"/>
-              <w:right w:type="dxa" w:w="130"/>
-            </w:tcMar>
-          </w:tcPr>
-          <w:p>
-            <w:pPr>
-              <w:spacing w:after="0" w:before="0" w:line="276"/>
-            </w:pPr>
-            <w:r>
-              <w:rPr>
-                <w:rFonts w:ascii="Calibri" w:cs="Calibri" w:eastAsia="Calibri" w:hAnsi="Calibri"/>
-                <w:b w:val="false"/>
-                <w:bCs w:val="false"/>
-                <w:color w:val="333333"/>
-                <w:sz w:val="17"/>
-                <w:szCs w:val="17"/>
-              </w:rPr>
-              <w:t xml:space="preserve">Sept 21–25</w:t>
-            </w:r>
-          </w:p>
-        </w:tc>
-        <w:tc>
-          <w:tcPr>
             <w:tcW w:type="dxa" w:w="3200"/>
             <w:tcMar>
               <w:top w:type="dxa" w:w="90"/>
@@ -8561,7 +8450,7 @@
         </w:tc>
         <w:tc>
           <w:tcPr>
-            <w:tcW w:type="dxa" w:w="3360"/>
+            <w:tcW w:type="dxa" w:w="5260"/>
             <w:tcMar>
               <w:top w:type="dxa" w:w="90"/>
               <w:left w:type="dxa" w:w="130"/>
@@ -8618,34 +8507,6 @@
         </w:tc>
         <w:tc>
           <w:tcPr>
-            <w:tcW w:type="dxa" w:w="1900"/>
-            <w:shd w:fill="F2F5F9" w:color="auto" w:val="clear"/>
-            <w:tcMar>
-              <w:top w:type="dxa" w:w="90"/>
-              <w:left w:type="dxa" w:w="130"/>
-              <w:bottom w:type="dxa" w:w="90"/>
-              <w:right w:type="dxa" w:w="130"/>
-            </w:tcMar>
-          </w:tcPr>
-          <w:p>
-            <w:pPr>
-              <w:spacing w:after="0" w:before="0" w:line="276"/>
-            </w:pPr>
-            <w:r>
-              <w:rPr>
-                <w:rFonts w:ascii="Calibri" w:cs="Calibri" w:eastAsia="Calibri" w:hAnsi="Calibri"/>
-                <w:b w:val="false"/>
-                <w:bCs w:val="false"/>
-                <w:color w:val="333333"/>
-                <w:sz w:val="17"/>
-                <w:szCs w:val="17"/>
-              </w:rPr>
-              <w:t xml:space="preserve">Sept 28 – Oct 2</w:t>
-            </w:r>
-          </w:p>
-        </w:tc>
-        <w:tc>
-          <w:tcPr>
             <w:tcW w:type="dxa" w:w="3200"/>
             <w:shd w:fill="F2F5F9" w:color="auto" w:val="clear"/>
             <w:tcMar>
@@ -8674,7 +8535,7 @@
         </w:tc>
         <w:tc>
           <w:tcPr>
-            <w:tcW w:type="dxa" w:w="3360"/>
+            <w:tcW w:type="dxa" w:w="5260"/>
             <w:shd w:fill="F2F5F9" w:color="auto" w:val="clear"/>
             <w:tcMar>
               <w:top w:type="dxa" w:w="90"/>
@@ -8731,33 +8592,6 @@
         </w:tc>
         <w:tc>
           <w:tcPr>
-            <w:tcW w:type="dxa" w:w="1900"/>
-            <w:tcMar>
-              <w:top w:type="dxa" w:w="90"/>
-              <w:left w:type="dxa" w:w="130"/>
-              <w:bottom w:type="dxa" w:w="90"/>
-              <w:right w:type="dxa" w:w="130"/>
-            </w:tcMar>
-          </w:tcPr>
-          <w:p>
-            <w:pPr>
-              <w:spacing w:after="0" w:before="0" w:line="276"/>
-            </w:pPr>
-            <w:r>
-              <w:rPr>
-                <w:rFonts w:ascii="Calibri" w:cs="Calibri" w:eastAsia="Calibri" w:hAnsi="Calibri"/>
-                <w:b w:val="false"/>
-                <w:bCs w:val="false"/>
-                <w:color w:val="333333"/>
-                <w:sz w:val="17"/>
-                <w:szCs w:val="17"/>
-              </w:rPr>
-              <w:t xml:space="preserve">Oct 5–9</w:t>
-            </w:r>
-          </w:p>
-        </w:tc>
-        <w:tc>
-          <w:tcPr>
             <w:tcW w:type="dxa" w:w="3200"/>
             <w:tcMar>
               <w:top w:type="dxa" w:w="90"/>
@@ -8785,28 +8619,28 @@
         </w:tc>
         <w:tc>
           <w:tcPr>
-            <w:tcW w:type="dxa" w:w="3360"/>
-            <w:tcMar>
-              <w:top w:type="dxa" w:w="90"/>
-              <w:left w:type="dxa" w:w="130"/>
-              <w:bottom w:type="dxa" w:w="90"/>
-              <w:right w:type="dxa" w:w="130"/>
-            </w:tcMar>
-          </w:tcPr>
-          <w:p>
-            <w:pPr>
-              <w:spacing w:after="0" w:before="0" w:line="276"/>
-            </w:pPr>
-            <w:r>
-              <w:rPr>
-                <w:rFonts w:ascii="Calibri" w:cs="Calibri" w:eastAsia="Calibri" w:hAnsi="Calibri"/>
-                <w:b w:val="false"/>
-                <w:bCs w:val="false"/>
-                <w:color w:val="333333"/>
-                <w:sz w:val="17"/>
-                <w:szCs w:val="17"/>
-              </w:rPr>
-              <w:t xml:space="preserve">Oct 9 NEOEA Day, no classes. Evaluation rubric drilled daily.</w:t>
+            <w:tcW w:type="dxa" w:w="5260"/>
+            <w:tcMar>
+              <w:top w:type="dxa" w:w="90"/>
+              <w:left w:type="dxa" w:w="130"/>
+              <w:bottom w:type="dxa" w:w="90"/>
+              <w:right w:type="dxa" w:w="130"/>
+            </w:tcMar>
+          </w:tcPr>
+          <w:p>
+            <w:pPr>
+              <w:spacing w:after="0" w:before="0" w:line="276"/>
+            </w:pPr>
+            <w:r>
+              <w:rPr>
+                <w:rFonts w:ascii="Calibri" w:cs="Calibri" w:eastAsia="Calibri" w:hAnsi="Calibri"/>
+                <w:b w:val="false"/>
+                <w:bCs w:val="false"/>
+                <w:color w:val="333333"/>
+                <w:sz w:val="17"/>
+                <w:szCs w:val="17"/>
+              </w:rPr>
+              <w:t xml:space="preserve">Evaluation rubric drilled daily. Prompt Autopsy build.</w:t>
             </w:r>
           </w:p>
         </w:tc>
@@ -8842,34 +8676,6 @@
         </w:tc>
         <w:tc>
           <w:tcPr>
-            <w:tcW w:type="dxa" w:w="1900"/>
-            <w:shd w:fill="F2F5F9" w:color="auto" w:val="clear"/>
-            <w:tcMar>
-              <w:top w:type="dxa" w:w="90"/>
-              <w:left w:type="dxa" w:w="130"/>
-              <w:bottom w:type="dxa" w:w="90"/>
-              <w:right w:type="dxa" w:w="130"/>
-            </w:tcMar>
-          </w:tcPr>
-          <w:p>
-            <w:pPr>
-              <w:spacing w:after="0" w:before="0" w:line="276"/>
-            </w:pPr>
-            <w:r>
-              <w:rPr>
-                <w:rFonts w:ascii="Calibri" w:cs="Calibri" w:eastAsia="Calibri" w:hAnsi="Calibri"/>
-                <w:b w:val="false"/>
-                <w:bCs w:val="false"/>
-                <w:color w:val="333333"/>
-                <w:sz w:val="17"/>
-                <w:szCs w:val="17"/>
-              </w:rPr>
-              <w:t xml:space="preserve">Oct 12–16</w:t>
-            </w:r>
-          </w:p>
-        </w:tc>
-        <w:tc>
-          <w:tcPr>
             <w:tcW w:type="dxa" w:w="3200"/>
             <w:shd w:fill="F2F5F9" w:color="auto" w:val="clear"/>
             <w:tcMar>
@@ -8898,29 +8704,29 @@
         </w:tc>
         <w:tc>
           <w:tcPr>
-            <w:tcW w:type="dxa" w:w="3360"/>
-            <w:shd w:fill="F2F5F9" w:color="auto" w:val="clear"/>
-            <w:tcMar>
-              <w:top w:type="dxa" w:w="90"/>
-              <w:left w:type="dxa" w:w="130"/>
-              <w:bottom w:type="dxa" w:w="90"/>
-              <w:right w:type="dxa" w:w="130"/>
-            </w:tcMar>
-          </w:tcPr>
-          <w:p>
-            <w:pPr>
-              <w:spacing w:after="0" w:before="0" w:line="276"/>
-            </w:pPr>
-            <w:r>
-              <w:rPr>
-                <w:rFonts w:ascii="Calibri" w:cs="Calibri" w:eastAsia="Calibri" w:hAnsi="Calibri"/>
-                <w:b w:val="false"/>
-                <w:bCs w:val="false"/>
-                <w:color w:val="333333"/>
-                <w:sz w:val="17"/>
-                <w:szCs w:val="17"/>
-              </w:rPr>
-              <w:t xml:space="preserve">Oct 16 Waiver Day, no classes. Hallucination Hunt due. Problem drop #1.</w:t>
+            <w:tcW w:type="dxa" w:w="5260"/>
+            <w:shd w:fill="F2F5F9" w:color="auto" w:val="clear"/>
+            <w:tcMar>
+              <w:top w:type="dxa" w:w="90"/>
+              <w:left w:type="dxa" w:w="130"/>
+              <w:bottom w:type="dxa" w:w="90"/>
+              <w:right w:type="dxa" w:w="130"/>
+            </w:tcMar>
+          </w:tcPr>
+          <w:p>
+            <w:pPr>
+              <w:spacing w:after="0" w:before="0" w:line="276"/>
+            </w:pPr>
+            <w:r>
+              <w:rPr>
+                <w:rFonts w:ascii="Calibri" w:cs="Calibri" w:eastAsia="Calibri" w:hAnsi="Calibri"/>
+                <w:b w:val="false"/>
+                <w:bCs w:val="false"/>
+                <w:color w:val="333333"/>
+                <w:sz w:val="17"/>
+                <w:szCs w:val="17"/>
+              </w:rPr>
+              <w:t xml:space="preserve">Hallucination Hunt due. Problem drop #1. Module 2 exit.</w:t>
             </w:r>
           </w:p>
         </w:tc>
@@ -8955,33 +8761,6 @@
         </w:tc>
         <w:tc>
           <w:tcPr>
-            <w:tcW w:type="dxa" w:w="1900"/>
-            <w:tcMar>
-              <w:top w:type="dxa" w:w="90"/>
-              <w:left w:type="dxa" w:w="130"/>
-              <w:bottom w:type="dxa" w:w="90"/>
-              <w:right w:type="dxa" w:w="130"/>
-            </w:tcMar>
-          </w:tcPr>
-          <w:p>
-            <w:pPr>
-              <w:spacing w:after="0" w:before="0" w:line="276"/>
-            </w:pPr>
-            <w:r>
-              <w:rPr>
-                <w:rFonts w:ascii="Calibri" w:cs="Calibri" w:eastAsia="Calibri" w:hAnsi="Calibri"/>
-                <w:b w:val="false"/>
-                <w:bCs w:val="false"/>
-                <w:color w:val="333333"/>
-                <w:sz w:val="17"/>
-                <w:szCs w:val="17"/>
-              </w:rPr>
-              <w:t xml:space="preserve">Oct 19–23</w:t>
-            </w:r>
-          </w:p>
-        </w:tc>
-        <w:tc>
-          <w:tcPr>
             <w:tcW w:type="dxa" w:w="3200"/>
             <w:tcMar>
               <w:top w:type="dxa" w:w="90"/>
@@ -9009,7 +8788,7 @@
         </w:tc>
         <w:tc>
           <w:tcPr>
-            <w:tcW w:type="dxa" w:w="3360"/>
+            <w:tcW w:type="dxa" w:w="5260"/>
             <w:tcMar>
               <w:top w:type="dxa" w:w="90"/>
               <w:left w:type="dxa" w:w="130"/>
@@ -9066,34 +8845,6 @@
         </w:tc>
         <w:tc>
           <w:tcPr>
-            <w:tcW w:type="dxa" w:w="1900"/>
-            <w:shd w:fill="F2F5F9" w:color="auto" w:val="clear"/>
-            <w:tcMar>
-              <w:top w:type="dxa" w:w="90"/>
-              <w:left w:type="dxa" w:w="130"/>
-              <w:bottom w:type="dxa" w:w="90"/>
-              <w:right w:type="dxa" w:w="130"/>
-            </w:tcMar>
-          </w:tcPr>
-          <w:p>
-            <w:pPr>
-              <w:spacing w:after="0" w:before="0" w:line="276"/>
-            </w:pPr>
-            <w:r>
-              <w:rPr>
-                <w:rFonts w:ascii="Calibri" w:cs="Calibri" w:eastAsia="Calibri" w:hAnsi="Calibri"/>
-                <w:b w:val="false"/>
-                <w:bCs w:val="false"/>
-                <w:color w:val="333333"/>
-                <w:sz w:val="17"/>
-                <w:szCs w:val="17"/>
-              </w:rPr>
-              <w:t xml:space="preserve">Oct 26–30</w:t>
-            </w:r>
-          </w:p>
-        </w:tc>
-        <w:tc>
-          <w:tcPr>
             <w:tcW w:type="dxa" w:w="3200"/>
             <w:shd w:fill="F2F5F9" w:color="auto" w:val="clear"/>
             <w:tcMar>
@@ -9122,29 +8873,29 @@
         </w:tc>
         <w:tc>
           <w:tcPr>
-            <w:tcW w:type="dxa" w:w="3360"/>
-            <w:shd w:fill="F2F5F9" w:color="auto" w:val="clear"/>
-            <w:tcMar>
-              <w:top w:type="dxa" w:w="90"/>
-              <w:left w:type="dxa" w:w="130"/>
-              <w:bottom w:type="dxa" w:w="90"/>
-              <w:right w:type="dxa" w:w="130"/>
-            </w:tcMar>
-          </w:tcPr>
-          <w:p>
-            <w:pPr>
-              <w:spacing w:after="0" w:before="0" w:line="276"/>
-            </w:pPr>
-            <w:r>
-              <w:rPr>
-                <w:rFonts w:ascii="Calibri" w:cs="Calibri" w:eastAsia="Calibri" w:hAnsi="Calibri"/>
-                <w:b w:val="false"/>
-                <w:bCs w:val="false"/>
-                <w:color w:val="333333"/>
-                <w:sz w:val="17"/>
-                <w:szCs w:val="17"/>
-              </w:rPr>
-              <w:t xml:space="preserve">CAC DEADLINE Oct 26. Licensing audit due.</w:t>
+            <w:tcW w:type="dxa" w:w="5260"/>
+            <w:shd w:fill="F2F5F9" w:color="auto" w:val="clear"/>
+            <w:tcMar>
+              <w:top w:type="dxa" w:w="90"/>
+              <w:left w:type="dxa" w:w="130"/>
+              <w:bottom w:type="dxa" w:w="90"/>
+              <w:right w:type="dxa" w:w="130"/>
+            </w:tcMar>
+          </w:tcPr>
+          <w:p>
+            <w:pPr>
+              <w:spacing w:after="0" w:before="0" w:line="276"/>
+            </w:pPr>
+            <w:r>
+              <w:rPr>
+                <w:rFonts w:ascii="Calibri" w:cs="Calibri" w:eastAsia="Calibri" w:hAnsi="Calibri"/>
+                <w:b w:val="false"/>
+                <w:bCs w:val="false"/>
+                <w:color w:val="333333"/>
+                <w:sz w:val="17"/>
+                <w:szCs w:val="17"/>
+              </w:rPr>
+              <w:t xml:space="preserve">CAC deadline usually this week. Licensing audit due.</w:t>
             </w:r>
           </w:p>
         </w:tc>
@@ -9179,33 +8930,6 @@
         </w:tc>
         <w:tc>
           <w:tcPr>
-            <w:tcW w:type="dxa" w:w="1900"/>
-            <w:tcMar>
-              <w:top w:type="dxa" w:w="90"/>
-              <w:left w:type="dxa" w:w="130"/>
-              <w:bottom w:type="dxa" w:w="90"/>
-              <w:right w:type="dxa" w:w="130"/>
-            </w:tcMar>
-          </w:tcPr>
-          <w:p>
-            <w:pPr>
-              <w:spacing w:after="0" w:before="0" w:line="276"/>
-            </w:pPr>
-            <w:r>
-              <w:rPr>
-                <w:rFonts w:ascii="Calibri" w:cs="Calibri" w:eastAsia="Calibri" w:hAnsi="Calibri"/>
-                <w:b w:val="false"/>
-                <w:bCs w:val="false"/>
-                <w:color w:val="333333"/>
-                <w:sz w:val="17"/>
-                <w:szCs w:val="17"/>
-              </w:rPr>
-              <w:t xml:space="preserve">Nov 2–6</w:t>
-            </w:r>
-          </w:p>
-        </w:tc>
-        <w:tc>
-          <w:tcPr>
             <w:tcW w:type="dxa" w:w="3200"/>
             <w:tcMar>
               <w:top w:type="dxa" w:w="90"/>
@@ -9233,28 +8957,28 @@
         </w:tc>
         <w:tc>
           <w:tcPr>
-            <w:tcW w:type="dxa" w:w="3360"/>
-            <w:tcMar>
-              <w:top w:type="dxa" w:w="90"/>
-              <w:left w:type="dxa" w:w="130"/>
-              <w:bottom w:type="dxa" w:w="90"/>
-              <w:right w:type="dxa" w:w="130"/>
-            </w:tcMar>
-          </w:tcPr>
-          <w:p>
-            <w:pPr>
-              <w:spacing w:after="0" w:before="0" w:line="276"/>
-            </w:pPr>
-            <w:r>
-              <w:rPr>
-                <w:rFonts w:ascii="Calibri" w:cs="Calibri" w:eastAsia="Calibri" w:hAnsi="Calibri"/>
-                <w:b w:val="false"/>
-                <w:bCs w:val="false"/>
-                <w:color w:val="333333"/>
-                <w:sz w:val="17"/>
-                <w:szCs w:val="17"/>
-              </w:rPr>
-              <w:t xml:space="preserve">Position paper and privacy assessment due. GP1 ENDS Nov 6.</w:t>
+            <w:tcW w:type="dxa" w:w="5260"/>
+            <w:tcMar>
+              <w:top w:type="dxa" w:w="90"/>
+              <w:left w:type="dxa" w:w="130"/>
+              <w:bottom w:type="dxa" w:w="90"/>
+              <w:right w:type="dxa" w:w="130"/>
+            </w:tcMar>
+          </w:tcPr>
+          <w:p>
+            <w:pPr>
+              <w:spacing w:after="0" w:before="0" w:line="276"/>
+            </w:pPr>
+            <w:r>
+              <w:rPr>
+                <w:rFonts w:ascii="Calibri" w:cs="Calibri" w:eastAsia="Calibri" w:hAnsi="Calibri"/>
+                <w:b w:val="false"/>
+                <w:bCs w:val="false"/>
+                <w:color w:val="333333"/>
+                <w:sz w:val="17"/>
+                <w:szCs w:val="17"/>
+              </w:rPr>
+              <w:t xml:space="preserve">Position paper and privacy assessment due. GP1 ENDS.</w:t>
             </w:r>
           </w:p>
         </w:tc>
@@ -9286,7 +9010,7 @@
           <w:sz w:val="25"/>
           <w:szCs w:val="25"/>
         </w:rPr>
-        <w:t xml:space="preserve">Grading Period 2  ·  November 9 – January 29  ·  Modules 4–6</w:t>
+        <w:t xml:space="preserve">Grading Period 2  ·  Weeks 10–18  ·  Modules 4–6</w:t>
       </w:r>
     </w:p>
     <w:tbl>
@@ -9303,9 +9027,8 @@
       </w:tblPr>
       <w:tblGrid>
         <w:gridCol w:w="900"/>
-        <w:gridCol w:w="1900"/>
         <w:gridCol w:w="3200"/>
-        <w:gridCol w:w="3360"/>
+        <w:gridCol w:w="5260"/>
       </w:tblGrid>
       <w:tr>
         <w:trPr>
@@ -9341,34 +9064,6 @@
         </w:tc>
         <w:tc>
           <w:tcPr>
-            <w:tcW w:type="dxa" w:w="1900"/>
-            <w:shd w:fill="1B3A5F" w:color="auto" w:val="clear"/>
-            <w:tcMar>
-              <w:top w:type="dxa" w:w="90"/>
-              <w:left w:type="dxa" w:w="130"/>
-              <w:bottom w:type="dxa" w:w="90"/>
-              <w:right w:type="dxa" w:w="130"/>
-            </w:tcMar>
-          </w:tcPr>
-          <w:p>
-            <w:pPr>
-              <w:spacing w:after="0" w:before="0" w:line="276"/>
-            </w:pPr>
-            <w:r>
-              <w:rPr>
-                <w:rFonts w:ascii="Calibri" w:cs="Calibri" w:eastAsia="Calibri" w:hAnsi="Calibri"/>
-                <w:b/>
-                <w:bCs/>
-                <w:color w:val="FFFFFF"/>
-                <w:sz w:val="17"/>
-                <w:szCs w:val="17"/>
-              </w:rPr>
-              <w:t xml:space="preserve">DATES</w:t>
-            </w:r>
-          </w:p>
-        </w:tc>
-        <w:tc>
-          <w:tcPr>
             <w:tcW w:type="dxa" w:w="3200"/>
             <w:shd w:fill="1B3A5F" w:color="auto" w:val="clear"/>
             <w:tcMar>
@@ -9397,7 +9092,7 @@
         </w:tc>
         <w:tc>
           <w:tcPr>
-            <w:tcW w:type="dxa" w:w="3360"/>
+            <w:tcW w:type="dxa" w:w="5260"/>
             <w:shd w:fill="1B3A5F" w:color="auto" w:val="clear"/>
             <w:tcMar>
               <w:top w:type="dxa" w:w="90"/>
@@ -9454,33 +9149,6 @@
         </w:tc>
         <w:tc>
           <w:tcPr>
-            <w:tcW w:type="dxa" w:w="1900"/>
-            <w:tcMar>
-              <w:top w:type="dxa" w:w="90"/>
-              <w:left w:type="dxa" w:w="130"/>
-              <w:bottom w:type="dxa" w:w="90"/>
-              <w:right w:type="dxa" w:w="130"/>
-            </w:tcMar>
-          </w:tcPr>
-          <w:p>
-            <w:pPr>
-              <w:spacing w:after="0" w:before="0" w:line="276"/>
-            </w:pPr>
-            <w:r>
-              <w:rPr>
-                <w:rFonts w:ascii="Calibri" w:cs="Calibri" w:eastAsia="Calibri" w:hAnsi="Calibri"/>
-                <w:b w:val="false"/>
-                <w:bCs w:val="false"/>
-                <w:color w:val="333333"/>
-                <w:sz w:val="17"/>
-                <w:szCs w:val="17"/>
-              </w:rPr>
-              <w:t xml:space="preserve">Nov 9–13</w:t>
-            </w:r>
-          </w:p>
-        </w:tc>
-        <w:tc>
-          <w:tcPr>
             <w:tcW w:type="dxa" w:w="3200"/>
             <w:tcMar>
               <w:top w:type="dxa" w:w="90"/>
@@ -9508,28 +9176,28 @@
         </w:tc>
         <w:tc>
           <w:tcPr>
-            <w:tcW w:type="dxa" w:w="3360"/>
-            <w:tcMar>
-              <w:top w:type="dxa" w:w="90"/>
-              <w:left w:type="dxa" w:w="130"/>
-              <w:bottom w:type="dxa" w:w="90"/>
-              <w:right w:type="dxa" w:w="130"/>
-            </w:tcMar>
-          </w:tcPr>
-          <w:p>
-            <w:pPr>
-              <w:spacing w:after="0" w:before="0" w:line="276"/>
-            </w:pPr>
-            <w:r>
-              <w:rPr>
-                <w:rFonts w:ascii="Calibri" w:cs="Calibri" w:eastAsia="Calibri" w:hAnsi="Calibri"/>
-                <w:b w:val="false"/>
-                <w:bCs w:val="false"/>
-                <w:color w:val="333333"/>
-                <w:sz w:val="17"/>
-                <w:szCs w:val="17"/>
-              </w:rPr>
-              <w:t xml:space="preserve">Database types and structures. NASA Space Apps Nov 14–15.</w:t>
+            <w:tcW w:type="dxa" w:w="5260"/>
+            <w:tcMar>
+              <w:top w:type="dxa" w:w="90"/>
+              <w:left w:type="dxa" w:w="130"/>
+              <w:bottom w:type="dxa" w:w="90"/>
+              <w:right w:type="dxa" w:w="130"/>
+            </w:tcMar>
+          </w:tcPr>
+          <w:p>
+            <w:pPr>
+              <w:spacing w:after="0" w:before="0" w:line="276"/>
+            </w:pPr>
+            <w:r>
+              <w:rPr>
+                <w:rFonts w:ascii="Calibri" w:cs="Calibri" w:eastAsia="Calibri" w:hAnsi="Calibri"/>
+                <w:b w:val="false"/>
+                <w:bCs w:val="false"/>
+                <w:color w:val="333333"/>
+                <w:sz w:val="17"/>
+                <w:szCs w:val="17"/>
+              </w:rPr>
+              <w:t xml:space="preserve">Database types and structures. Ingestion opens.</w:t>
             </w:r>
           </w:p>
         </w:tc>
@@ -9565,34 +9233,6 @@
         </w:tc>
         <w:tc>
           <w:tcPr>
-            <w:tcW w:type="dxa" w:w="1900"/>
-            <w:shd w:fill="F2F5F9" w:color="auto" w:val="clear"/>
-            <w:tcMar>
-              <w:top w:type="dxa" w:w="90"/>
-              <w:left w:type="dxa" w:w="130"/>
-              <w:bottom w:type="dxa" w:w="90"/>
-              <w:right w:type="dxa" w:w="130"/>
-            </w:tcMar>
-          </w:tcPr>
-          <w:p>
-            <w:pPr>
-              <w:spacing w:after="0" w:before="0" w:line="276"/>
-            </w:pPr>
-            <w:r>
-              <w:rPr>
-                <w:rFonts w:ascii="Calibri" w:cs="Calibri" w:eastAsia="Calibri" w:hAnsi="Calibri"/>
-                <w:b w:val="false"/>
-                <w:bCs w:val="false"/>
-                <w:color w:val="333333"/>
-                <w:sz w:val="17"/>
-                <w:szCs w:val="17"/>
-              </w:rPr>
-              <w:t xml:space="preserve">Nov 16–20</w:t>
-            </w:r>
-          </w:p>
-        </w:tc>
-        <w:tc>
-          <w:tcPr>
             <w:tcW w:type="dxa" w:w="3200"/>
             <w:shd w:fill="F2F5F9" w:color="auto" w:val="clear"/>
             <w:tcMar>
@@ -9621,29 +9261,29 @@
         </w:tc>
         <w:tc>
           <w:tcPr>
-            <w:tcW w:type="dxa" w:w="3360"/>
-            <w:shd w:fill="F2F5F9" w:color="auto" w:val="clear"/>
-            <w:tcMar>
-              <w:top w:type="dxa" w:w="90"/>
-              <w:left w:type="dxa" w:w="130"/>
-              <w:bottom w:type="dxa" w:w="90"/>
-              <w:right w:type="dxa" w:w="130"/>
-            </w:tcMar>
-          </w:tcPr>
-          <w:p>
-            <w:pPr>
-              <w:spacing w:after="0" w:before="0" w:line="276"/>
-            </w:pPr>
-            <w:r>
-              <w:rPr>
-                <w:rFonts w:ascii="Calibri" w:cs="Calibri" w:eastAsia="Calibri" w:hAnsi="Calibri"/>
-                <w:b w:val="false"/>
-                <w:bCs w:val="false"/>
-                <w:color w:val="333333"/>
-                <w:sz w:val="17"/>
-                <w:szCs w:val="17"/>
-              </w:rPr>
-              <w:t xml:space="preserve">Pipeline build. Format migration. Nov 19 conferences.</w:t>
+            <w:tcW w:type="dxa" w:w="5260"/>
+            <w:shd w:fill="F2F5F9" w:color="auto" w:val="clear"/>
+            <w:tcMar>
+              <w:top w:type="dxa" w:w="90"/>
+              <w:left w:type="dxa" w:w="130"/>
+              <w:bottom w:type="dxa" w:w="90"/>
+              <w:right w:type="dxa" w:w="130"/>
+            </w:tcMar>
+          </w:tcPr>
+          <w:p>
+            <w:pPr>
+              <w:spacing w:after="0" w:before="0" w:line="276"/>
+            </w:pPr>
+            <w:r>
+              <w:rPr>
+                <w:rFonts w:ascii="Calibri" w:cs="Calibri" w:eastAsia="Calibri" w:hAnsi="Calibri"/>
+                <w:b w:val="false"/>
+                <w:bCs w:val="false"/>
+                <w:color w:val="333333"/>
+                <w:sz w:val="17"/>
+                <w:szCs w:val="17"/>
+              </w:rPr>
+              <w:t xml:space="preserve">Pipeline build. Format migration.</w:t>
             </w:r>
           </w:p>
         </w:tc>
@@ -9678,33 +9318,6 @@
         </w:tc>
         <w:tc>
           <w:tcPr>
-            <w:tcW w:type="dxa" w:w="1900"/>
-            <w:tcMar>
-              <w:top w:type="dxa" w:w="90"/>
-              <w:left w:type="dxa" w:w="130"/>
-              <w:bottom w:type="dxa" w:w="90"/>
-              <w:right w:type="dxa" w:w="130"/>
-            </w:tcMar>
-          </w:tcPr>
-          <w:p>
-            <w:pPr>
-              <w:spacing w:after="0" w:before="0" w:line="276"/>
-            </w:pPr>
-            <w:r>
-              <w:rPr>
-                <w:rFonts w:ascii="Calibri" w:cs="Calibri" w:eastAsia="Calibri" w:hAnsi="Calibri"/>
-                <w:b w:val="false"/>
-                <w:bCs w:val="false"/>
-                <w:color w:val="333333"/>
-                <w:sz w:val="17"/>
-                <w:szCs w:val="17"/>
-              </w:rPr>
-              <w:t xml:space="preserve">Nov 23–24</w:t>
-            </w:r>
-          </w:p>
-        </w:tc>
-        <w:tc>
-          <w:tcPr>
             <w:tcW w:type="dxa" w:w="3200"/>
             <w:tcMar>
               <w:top w:type="dxa" w:w="90"/>
@@ -9732,28 +9345,28 @@
         </w:tc>
         <w:tc>
           <w:tcPr>
-            <w:tcW w:type="dxa" w:w="3360"/>
-            <w:tcMar>
-              <w:top w:type="dxa" w:w="90"/>
-              <w:left w:type="dxa" w:w="130"/>
-              <w:bottom w:type="dxa" w:w="90"/>
-              <w:right w:type="dxa" w:w="130"/>
-            </w:tcMar>
-          </w:tcPr>
-          <w:p>
-            <w:pPr>
-              <w:spacing w:after="0" w:before="0" w:line="276"/>
-            </w:pPr>
-            <w:r>
-              <w:rPr>
-                <w:rFonts w:ascii="Calibri" w:cs="Calibri" w:eastAsia="Calibri" w:hAnsi="Calibri"/>
-                <w:b w:val="false"/>
-                <w:bCs w:val="false"/>
-                <w:color w:val="333333"/>
-                <w:sz w:val="17"/>
-                <w:szCs w:val="17"/>
-              </w:rPr>
-              <w:t xml:space="preserve">BPA PRE-SUBMISSION Nov 24. Break Nov 25–27. Two-day week.</w:t>
+            <w:tcW w:type="dxa" w:w="5260"/>
+            <w:tcMar>
+              <w:top w:type="dxa" w:w="90"/>
+              <w:left w:type="dxa" w:w="130"/>
+              <w:bottom w:type="dxa" w:w="90"/>
+              <w:right w:type="dxa" w:w="130"/>
+            </w:tcMar>
+          </w:tcPr>
+          <w:p>
+            <w:pPr>
+              <w:spacing w:after="0" w:before="0" w:line="276"/>
+            </w:pPr>
+            <w:r>
+              <w:rPr>
+                <w:rFonts w:ascii="Calibri" w:cs="Calibri" w:eastAsia="Calibri" w:hAnsi="Calibri"/>
+                <w:b w:val="false"/>
+                <w:bCs w:val="false"/>
+                <w:color w:val="333333"/>
+                <w:sz w:val="17"/>
+                <w:szCs w:val="17"/>
+              </w:rPr>
+              <w:t xml:space="preserve">Retrieval build. Module 4 exit. BPA pre-submission usually follows.</w:t>
             </w:r>
           </w:p>
         </w:tc>
@@ -9789,34 +9402,6 @@
         </w:tc>
         <w:tc>
           <w:tcPr>
-            <w:tcW w:type="dxa" w:w="1900"/>
-            <w:shd w:fill="F2F5F9" w:color="auto" w:val="clear"/>
-            <w:tcMar>
-              <w:top w:type="dxa" w:w="90"/>
-              <w:left w:type="dxa" w:w="130"/>
-              <w:bottom w:type="dxa" w:w="90"/>
-              <w:right w:type="dxa" w:w="130"/>
-            </w:tcMar>
-          </w:tcPr>
-          <w:p>
-            <w:pPr>
-              <w:spacing w:after="0" w:before="0" w:line="276"/>
-            </w:pPr>
-            <w:r>
-              <w:rPr>
-                <w:rFonts w:ascii="Calibri" w:cs="Calibri" w:eastAsia="Calibri" w:hAnsi="Calibri"/>
-                <w:b w:val="false"/>
-                <w:bCs w:val="false"/>
-                <w:color w:val="333333"/>
-                <w:sz w:val="17"/>
-                <w:szCs w:val="17"/>
-              </w:rPr>
-              <w:t xml:space="preserve">Nov 30 – Dec 4</w:t>
-            </w:r>
-          </w:p>
-        </w:tc>
-        <w:tc>
-          <w:tcPr>
             <w:tcW w:type="dxa" w:w="3200"/>
             <w:shd w:fill="F2F5F9" w:color="auto" w:val="clear"/>
             <w:tcMar>
@@ -9845,7 +9430,7 @@
         </w:tc>
         <w:tc>
           <w:tcPr>
-            <w:tcW w:type="dxa" w:w="3360"/>
+            <w:tcW w:type="dxa" w:w="5260"/>
             <w:shd w:fill="F2F5F9" w:color="auto" w:val="clear"/>
             <w:tcMar>
               <w:top w:type="dxa" w:w="90"/>
@@ -9902,33 +9487,6 @@
         </w:tc>
         <w:tc>
           <w:tcPr>
-            <w:tcW w:type="dxa" w:w="1900"/>
-            <w:tcMar>
-              <w:top w:type="dxa" w:w="90"/>
-              <w:left w:type="dxa" w:w="130"/>
-              <w:bottom w:type="dxa" w:w="90"/>
-              <w:right w:type="dxa" w:w="130"/>
-            </w:tcMar>
-          </w:tcPr>
-          <w:p>
-            <w:pPr>
-              <w:spacing w:after="0" w:before="0" w:line="276"/>
-            </w:pPr>
-            <w:r>
-              <w:rPr>
-                <w:rFonts w:ascii="Calibri" w:cs="Calibri" w:eastAsia="Calibri" w:hAnsi="Calibri"/>
-                <w:b w:val="false"/>
-                <w:bCs w:val="false"/>
-                <w:color w:val="333333"/>
-                <w:sz w:val="17"/>
-                <w:szCs w:val="17"/>
-              </w:rPr>
-              <w:t xml:space="preserve">Dec 7–11</w:t>
-            </w:r>
-          </w:p>
-        </w:tc>
-        <w:tc>
-          <w:tcPr>
             <w:tcW w:type="dxa" w:w="3200"/>
             <w:tcMar>
               <w:top w:type="dxa" w:w="90"/>
@@ -9956,28 +9514,28 @@
         </w:tc>
         <w:tc>
           <w:tcPr>
-            <w:tcW w:type="dxa" w:w="3360"/>
-            <w:tcMar>
-              <w:top w:type="dxa" w:w="90"/>
-              <w:left w:type="dxa" w:w="130"/>
-              <w:bottom w:type="dxa" w:w="90"/>
-              <w:right w:type="dxa" w:w="130"/>
-            </w:tcMar>
-          </w:tcPr>
-          <w:p>
-            <w:pPr>
-              <w:spacing w:after="0" w:before="0" w:line="276"/>
-            </w:pPr>
-            <w:r>
-              <w:rPr>
-                <w:rFonts w:ascii="Calibri" w:cs="Calibri" w:eastAsia="Calibri" w:hAnsi="Calibri"/>
-                <w:b w:val="false"/>
-                <w:bCs w:val="false"/>
-                <w:color w:val="333333"/>
-                <w:sz w:val="17"/>
-                <w:szCs w:val="17"/>
-              </w:rPr>
-              <w:t xml:space="preserve">BPA REGIONAL CODING Dec 7–9. PRESENTATIONS Dec 11.</w:t>
+            <w:tcW w:type="dxa" w:w="5260"/>
+            <w:tcMar>
+              <w:top w:type="dxa" w:w="90"/>
+              <w:left w:type="dxa" w:w="130"/>
+              <w:bottom w:type="dxa" w:w="90"/>
+              <w:right w:type="dxa" w:w="130"/>
+            </w:tcMar>
+          </w:tcPr>
+          <w:p>
+            <w:pPr>
+              <w:spacing w:after="0" w:before="0" w:line="276"/>
+            </w:pPr>
+            <w:r>
+              <w:rPr>
+                <w:rFonts w:ascii="Calibri" w:cs="Calibri" w:eastAsia="Calibri" w:hAnsi="Calibri"/>
+                <w:b w:val="false"/>
+                <w:bCs w:val="false"/>
+                <w:color w:val="333333"/>
+                <w:sz w:val="17"/>
+                <w:szCs w:val="17"/>
+              </w:rPr>
+              <w:t xml:space="preserve">BPA REGIONAL usually this week. Competition week: self-directed build.</w:t>
             </w:r>
           </w:p>
         </w:tc>
@@ -10013,34 +9571,6 @@
         </w:tc>
         <w:tc>
           <w:tcPr>
-            <w:tcW w:type="dxa" w:w="1900"/>
-            <w:shd w:fill="F2F5F9" w:color="auto" w:val="clear"/>
-            <w:tcMar>
-              <w:top w:type="dxa" w:w="90"/>
-              <w:left w:type="dxa" w:w="130"/>
-              <w:bottom w:type="dxa" w:w="90"/>
-              <w:right w:type="dxa" w:w="130"/>
-            </w:tcMar>
-          </w:tcPr>
-          <w:p>
-            <w:pPr>
-              <w:spacing w:after="0" w:before="0" w:line="276"/>
-            </w:pPr>
-            <w:r>
-              <w:rPr>
-                <w:rFonts w:ascii="Calibri" w:cs="Calibri" w:eastAsia="Calibri" w:hAnsi="Calibri"/>
-                <w:b w:val="false"/>
-                <w:bCs w:val="false"/>
-                <w:color w:val="333333"/>
-                <w:sz w:val="17"/>
-                <w:szCs w:val="17"/>
-              </w:rPr>
-              <w:t xml:space="preserve">Dec 14–18</w:t>
-            </w:r>
-          </w:p>
-        </w:tc>
-        <w:tc>
-          <w:tcPr>
             <w:tcW w:type="dxa" w:w="3200"/>
             <w:shd w:fill="F2F5F9" w:color="auto" w:val="clear"/>
             <w:tcMar>
@@ -10069,29 +9599,29 @@
         </w:tc>
         <w:tc>
           <w:tcPr>
-            <w:tcW w:type="dxa" w:w="3360"/>
-            <w:shd w:fill="F2F5F9" w:color="auto" w:val="clear"/>
-            <w:tcMar>
-              <w:top w:type="dxa" w:w="90"/>
-              <w:left w:type="dxa" w:w="130"/>
-              <w:bottom w:type="dxa" w:w="90"/>
-              <w:right w:type="dxa" w:w="130"/>
-            </w:tcMar>
-          </w:tcPr>
-          <w:p>
-            <w:pPr>
-              <w:spacing w:after="0" w:before="0" w:line="276"/>
-            </w:pPr>
-            <w:r>
-              <w:rPr>
-                <w:rFonts w:ascii="Calibri" w:cs="Calibri" w:eastAsia="Calibri" w:hAnsi="Calibri"/>
-                <w:b w:val="false"/>
-                <w:bCs w:val="false"/>
-                <w:color w:val="333333"/>
-                <w:sz w:val="17"/>
-                <w:szCs w:val="17"/>
-              </w:rPr>
-              <w:t xml:space="preserve">Peer walkthrough. Banquet Dec 17. Break begins Dec 21.</w:t>
+            <w:tcW w:type="dxa" w:w="5260"/>
+            <w:shd w:fill="F2F5F9" w:color="auto" w:val="clear"/>
+            <w:tcMar>
+              <w:top w:type="dxa" w:w="90"/>
+              <w:left w:type="dxa" w:w="130"/>
+              <w:bottom w:type="dxa" w:w="90"/>
+              <w:right w:type="dxa" w:w="130"/>
+            </w:tcMar>
+          </w:tcPr>
+          <w:p>
+            <w:pPr>
+              <w:spacing w:after="0" w:before="0" w:line="276"/>
+            </w:pPr>
+            <w:r>
+              <w:rPr>
+                <w:rFonts w:ascii="Calibri" w:cs="Calibri" w:eastAsia="Calibri" w:hAnsi="Calibri"/>
+                <w:b w:val="false"/>
+                <w:bCs w:val="false"/>
+                <w:color w:val="333333"/>
+                <w:sz w:val="17"/>
+                <w:szCs w:val="17"/>
+              </w:rPr>
+              <w:t xml:space="preserve">Peer walkthrough. Application due. Module 5 exit.</w:t>
             </w:r>
           </w:p>
         </w:tc>
@@ -10126,33 +9656,6 @@
         </w:tc>
         <w:tc>
           <w:tcPr>
-            <w:tcW w:type="dxa" w:w="1900"/>
-            <w:tcMar>
-              <w:top w:type="dxa" w:w="90"/>
-              <w:left w:type="dxa" w:w="130"/>
-              <w:bottom w:type="dxa" w:w="90"/>
-              <w:right w:type="dxa" w:w="130"/>
-            </w:tcMar>
-          </w:tcPr>
-          <w:p>
-            <w:pPr>
-              <w:spacing w:after="0" w:before="0" w:line="276"/>
-            </w:pPr>
-            <w:r>
-              <w:rPr>
-                <w:rFonts w:ascii="Calibri" w:cs="Calibri" w:eastAsia="Calibri" w:hAnsi="Calibri"/>
-                <w:b w:val="false"/>
-                <w:bCs w:val="false"/>
-                <w:color w:val="333333"/>
-                <w:sz w:val="17"/>
-                <w:szCs w:val="17"/>
-              </w:rPr>
-              <w:t xml:space="preserve">Jan 4–8</w:t>
-            </w:r>
-          </w:p>
-        </w:tc>
-        <w:tc>
-          <w:tcPr>
             <w:tcW w:type="dxa" w:w="3200"/>
             <w:tcMar>
               <w:top w:type="dxa" w:w="90"/>
@@ -10180,28 +9683,28 @@
         </w:tc>
         <w:tc>
           <w:tcPr>
-            <w:tcW w:type="dxa" w:w="3360"/>
-            <w:tcMar>
-              <w:top w:type="dxa" w:w="90"/>
-              <w:left w:type="dxa" w:w="130"/>
-              <w:bottom w:type="dxa" w:w="90"/>
-              <w:right w:type="dxa" w:w="130"/>
-            </w:tcMar>
-          </w:tcPr>
-          <w:p>
-            <w:pPr>
-              <w:spacing w:after="0" w:before="0" w:line="276"/>
-            </w:pPr>
-            <w:r>
-              <w:rPr>
-                <w:rFonts w:ascii="Calibri" w:cs="Calibri" w:eastAsia="Calibri" w:hAnsi="Calibri"/>
-                <w:b w:val="false"/>
-                <w:bCs w:val="false"/>
-                <w:color w:val="333333"/>
-                <w:sz w:val="17"/>
-                <w:szCs w:val="17"/>
-              </w:rPr>
-              <w:t xml:space="preserve">Return from break. Usability study opens. Figma.</w:t>
+            <w:tcW w:type="dxa" w:w="5260"/>
+            <w:tcMar>
+              <w:top w:type="dxa" w:w="90"/>
+              <w:left w:type="dxa" w:w="130"/>
+              <w:bottom w:type="dxa" w:w="90"/>
+              <w:right w:type="dxa" w:w="130"/>
+            </w:tcMar>
+          </w:tcPr>
+          <w:p>
+            <w:pPr>
+              <w:spacing w:after="0" w:before="0" w:line="276"/>
+            </w:pPr>
+            <w:r>
+              <w:rPr>
+                <w:rFonts w:ascii="Calibri" w:cs="Calibri" w:eastAsia="Calibri" w:hAnsi="Calibri"/>
+                <w:b w:val="false"/>
+                <w:bCs w:val="false"/>
+                <w:color w:val="333333"/>
+                <w:sz w:val="17"/>
+                <w:szCs w:val="17"/>
+              </w:rPr>
+              <w:t xml:space="preserve">Usability study opens. Wireframing.</w:t>
             </w:r>
           </w:p>
         </w:tc>
@@ -10237,34 +9740,6 @@
         </w:tc>
         <w:tc>
           <w:tcPr>
-            <w:tcW w:type="dxa" w:w="1900"/>
-            <w:shd w:fill="F2F5F9" w:color="auto" w:val="clear"/>
-            <w:tcMar>
-              <w:top w:type="dxa" w:w="90"/>
-              <w:left w:type="dxa" w:w="130"/>
-              <w:bottom w:type="dxa" w:w="90"/>
-              <w:right w:type="dxa" w:w="130"/>
-            </w:tcMar>
-          </w:tcPr>
-          <w:p>
-            <w:pPr>
-              <w:spacing w:after="0" w:before="0" w:line="276"/>
-            </w:pPr>
-            <w:r>
-              <w:rPr>
-                <w:rFonts w:ascii="Calibri" w:cs="Calibri" w:eastAsia="Calibri" w:hAnsi="Calibri"/>
-                <w:b w:val="false"/>
-                <w:bCs w:val="false"/>
-                <w:color w:val="333333"/>
-                <w:sz w:val="17"/>
-                <w:szCs w:val="17"/>
-              </w:rPr>
-              <w:t xml:space="preserve">Jan 11–15</w:t>
-            </w:r>
-          </w:p>
-        </w:tc>
-        <w:tc>
-          <w:tcPr>
             <w:tcW w:type="dxa" w:w="3200"/>
             <w:shd w:fill="F2F5F9" w:color="auto" w:val="clear"/>
             <w:tcMar>
@@ -10293,7 +9768,7 @@
         </w:tc>
         <w:tc>
           <w:tcPr>
-            <w:tcW w:type="dxa" w:w="3360"/>
+            <w:tcW w:type="dxa" w:w="5260"/>
             <w:shd w:fill="F2F5F9" w:color="auto" w:val="clear"/>
             <w:tcMar>
               <w:top w:type="dxa" w:w="90"/>
@@ -10350,33 +9825,6 @@
         </w:tc>
         <w:tc>
           <w:tcPr>
-            <w:tcW w:type="dxa" w:w="1900"/>
-            <w:tcMar>
-              <w:top w:type="dxa" w:w="90"/>
-              <w:left w:type="dxa" w:w="130"/>
-              <w:bottom w:type="dxa" w:w="90"/>
-              <w:right w:type="dxa" w:w="130"/>
-            </w:tcMar>
-          </w:tcPr>
-          <w:p>
-            <w:pPr>
-              <w:spacing w:after="0" w:before="0" w:line="276"/>
-            </w:pPr>
-            <w:r>
-              <w:rPr>
-                <w:rFonts w:ascii="Calibri" w:cs="Calibri" w:eastAsia="Calibri" w:hAnsi="Calibri"/>
-                <w:b w:val="false"/>
-                <w:bCs w:val="false"/>
-                <w:color w:val="333333"/>
-                <w:sz w:val="17"/>
-                <w:szCs w:val="17"/>
-              </w:rPr>
-              <w:t xml:space="preserve">Jan 18–22</w:t>
-            </w:r>
-          </w:p>
-        </w:tc>
-        <w:tc>
-          <w:tcPr>
             <w:tcW w:type="dxa" w:w="3200"/>
             <w:tcMar>
               <w:top w:type="dxa" w:w="90"/>
@@ -10398,148 +9846,34 @@
                 <w:sz w:val="17"/>
                 <w:szCs w:val="17"/>
               </w:rPr>
-              <w:t xml:space="preserve">M6 exit</w:t>
-            </w:r>
-          </w:p>
-        </w:tc>
-        <w:tc>
-          <w:tcPr>
-            <w:tcW w:type="dxa" w:w="3360"/>
-            <w:tcMar>
-              <w:top w:type="dxa" w:w="90"/>
-              <w:left w:type="dxa" w:w="130"/>
-              <w:bottom w:type="dxa" w:w="90"/>
-              <w:right w:type="dxa" w:w="130"/>
-            </w:tcMar>
-          </w:tcPr>
-          <w:p>
-            <w:pPr>
-              <w:spacing w:after="0" w:before="0" w:line="276"/>
-            </w:pPr>
-            <w:r>
-              <w:rPr>
-                <w:rFonts w:ascii="Calibri" w:cs="Calibri" w:eastAsia="Calibri" w:hAnsi="Calibri"/>
-                <w:b w:val="false"/>
-                <w:bCs w:val="false"/>
-                <w:color w:val="333333"/>
-                <w:sz w:val="17"/>
-                <w:szCs w:val="17"/>
-              </w:rPr>
-              <w:t xml:space="preserve">Jan 18 MLK, no classes. n8n automation and opportunity analysis due.</w:t>
-            </w:r>
-          </w:p>
-        </w:tc>
-      </w:tr>
-      <w:tr>
-        <w:tc>
-          <w:tcPr>
-            <w:tcW w:type="dxa" w:w="900"/>
-            <w:shd w:fill="F2F5F9" w:color="auto" w:val="clear"/>
-            <w:tcMar>
-              <w:top w:type="dxa" w:w="90"/>
-              <w:left w:type="dxa" w:w="130"/>
-              <w:bottom w:type="dxa" w:w="90"/>
-              <w:right w:type="dxa" w:w="130"/>
-            </w:tcMar>
-          </w:tcPr>
-          <w:p>
-            <w:pPr>
-              <w:spacing w:after="0" w:before="0" w:line="276"/>
-            </w:pPr>
-            <w:r>
-              <w:rPr>
-                <w:rFonts w:ascii="Calibri" w:cs="Calibri" w:eastAsia="Calibri" w:hAnsi="Calibri"/>
-                <w:b/>
-                <w:bCs/>
-                <w:color w:val="1B3A5F"/>
-                <w:sz w:val="17"/>
-                <w:szCs w:val="17"/>
-              </w:rPr>
-              <w:t xml:space="preserve">19</w:t>
-            </w:r>
-          </w:p>
-        </w:tc>
-        <w:tc>
-          <w:tcPr>
-            <w:tcW w:type="dxa" w:w="1900"/>
-            <w:shd w:fill="F2F5F9" w:color="auto" w:val="clear"/>
-            <w:tcMar>
-              <w:top w:type="dxa" w:w="90"/>
-              <w:left w:type="dxa" w:w="130"/>
-              <w:bottom w:type="dxa" w:w="90"/>
-              <w:right w:type="dxa" w:w="130"/>
-            </w:tcMar>
-          </w:tcPr>
-          <w:p>
-            <w:pPr>
-              <w:spacing w:after="0" w:before="0" w:line="276"/>
-            </w:pPr>
-            <w:r>
-              <w:rPr>
-                <w:rFonts w:ascii="Calibri" w:cs="Calibri" w:eastAsia="Calibri" w:hAnsi="Calibri"/>
-                <w:b w:val="false"/>
-                <w:bCs w:val="false"/>
-                <w:color w:val="333333"/>
-                <w:sz w:val="17"/>
-                <w:szCs w:val="17"/>
-              </w:rPr>
-              <w:t xml:space="preserve">Jan 25–29</w:t>
-            </w:r>
-          </w:p>
-        </w:tc>
-        <w:tc>
-          <w:tcPr>
-            <w:tcW w:type="dxa" w:w="3200"/>
-            <w:shd w:fill="F2F5F9" w:color="auto" w:val="clear"/>
-            <w:tcMar>
-              <w:top w:type="dxa" w:w="90"/>
-              <w:left w:type="dxa" w:w="130"/>
-              <w:bottom w:type="dxa" w:w="90"/>
-              <w:right w:type="dxa" w:w="130"/>
-            </w:tcMar>
-          </w:tcPr>
-          <w:p>
-            <w:pPr>
-              <w:spacing w:after="0" w:before="0" w:line="276"/>
-            </w:pPr>
-            <w:r>
-              <w:rPr>
-                <w:rFonts w:ascii="Calibri" w:cs="Calibri" w:eastAsia="Calibri" w:hAnsi="Calibri"/>
-                <w:b w:val="false"/>
-                <w:bCs w:val="false"/>
-                <w:color w:val="333333"/>
-                <w:sz w:val="17"/>
-                <w:szCs w:val="17"/>
-              </w:rPr>
-              <w:t xml:space="preserve">Assessment</w:t>
-            </w:r>
-          </w:p>
-        </w:tc>
-        <w:tc>
-          <w:tcPr>
-            <w:tcW w:type="dxa" w:w="3360"/>
-            <w:shd w:fill="F2F5F9" w:color="auto" w:val="clear"/>
-            <w:tcMar>
-              <w:top w:type="dxa" w:w="90"/>
-              <w:left w:type="dxa" w:w="130"/>
-              <w:bottom w:type="dxa" w:w="90"/>
-              <w:right w:type="dxa" w:w="130"/>
-            </w:tcMar>
-          </w:tcPr>
-          <w:p>
-            <w:pPr>
-              <w:spacing w:after="0" w:before="0" w:line="276"/>
-            </w:pPr>
-            <w:r>
-              <w:rPr>
-                <w:rFonts w:ascii="Calibri" w:cs="Calibri" w:eastAsia="Calibri" w:hAnsi="Calibri"/>
-                <w:b w:val="false"/>
-                <w:bCs w:val="false"/>
-                <w:color w:val="333333"/>
-                <w:sz w:val="17"/>
-                <w:szCs w:val="17"/>
-              </w:rPr>
-              <w:t xml:space="preserve">WEBXAM POST-TEST. Acceptance testing. Final demos. GP2 ENDS.</w:t>
+              <w:t xml:space="preserve">M6 exit + Assessment</w:t>
+            </w:r>
+          </w:p>
+        </w:tc>
+        <w:tc>
+          <w:tcPr>
+            <w:tcW w:type="dxa" w:w="5260"/>
+            <w:tcMar>
+              <w:top w:type="dxa" w:w="90"/>
+              <w:left w:type="dxa" w:w="130"/>
+              <w:bottom w:type="dxa" w:w="90"/>
+              <w:right w:type="dxa" w:w="130"/>
+            </w:tcMar>
+          </w:tcPr>
+          <w:p>
+            <w:pPr>
+              <w:spacing w:after="0" w:before="0" w:line="276"/>
+            </w:pPr>
+            <w:r>
+              <w:rPr>
+                <w:rFonts w:ascii="Calibri" w:cs="Calibri" w:eastAsia="Calibri" w:hAnsi="Calibri"/>
+                <w:b w:val="false"/>
+                <w:bCs w:val="false"/>
+                <w:color w:val="333333"/>
+                <w:sz w:val="17"/>
+                <w:szCs w:val="17"/>
+              </w:rPr>
+              <w:t xml:space="preserve">Automation and opportunity analysis due. WEBXAM POST-TEST. Acceptance testing. Final demos. GP2 ENDS.</w:t>
             </w:r>
           </w:p>
         </w:tc>
@@ -11765,7 +11099,7 @@
                 <w:sz w:val="17"/>
                 <w:szCs w:val="17"/>
               </w:rPr>
-              <w:t xml:space="preserve">19</w:t>
+              <w:t xml:space="preserve">18 (shared)</w:t>
             </w:r>
           </w:p>
         </w:tc>
@@ -14596,7 +13930,7 @@
           <w:sz w:val="16"/>
           <w:szCs w:val="16"/>
         </w:rPr>
-        <w:t xml:space="preserve">Version 2.0  ·  August 2026  ·  Supersedes Version 1.0. Restructured into six portable three-week modules. Pairs with the Course Prompt Guide and Program Style &amp; Reference Guide.</w:t>
+        <w:t xml:space="preserve">Version 2.1  ·  18-week structure, no calendar dates  ·  Supersedes Version 2.0. Six portable three-week modules. Pairs with the Course Prompt Guide and Program Style &amp; Reference Guide.</w:t>
       </w:r>
     </w:p>
     <w:sectPr>
@@ -14665,7 +13999,7 @@
         <w:sz w:val="16"/>
         <w:szCs w:val="16"/>
       </w:rPr>
-      <w:t xml:space="preserve">145130 Applications of AI  ·  2026–2027  ·  Page </w:t>
+      <w:t xml:space="preserve">145130 Applications of AI  ·  Page </w:t>
     </w:r>
     <w:r>
       <w:rPr>

</xml_diff>